<commit_message>
complete export register to file module
</commit_message>
<xml_diff>
--- a/!docs/Опис проектів рішення комплекса Smart Royalty Service.docx
+++ b/!docs/Опис проектів рішення комплекса Smart Royalty Service.docx
@@ -147,6 +147,8 @@
         </w:rPr>
         <w:t>:</w:t>
       </w:r>
+      <w:bookmarkStart w:id="0" w:name="_GoBack"/>
+      <w:bookmarkEnd w:id="0"/>
     </w:p>
     <w:p>
       <w:pPr>
@@ -4048,12 +4050,20 @@
         </w:rPr>
         <w:t>папка з утилітами</w:t>
       </w:r>
+      <w:r>
+        <w:rPr>
+          <w:rFonts w:ascii="Consolas" w:hAnsi="Consolas" w:cs="Consolas"/>
+          <w:sz w:val="19"/>
+          <w:szCs w:val="19"/>
+          <w:lang w:val="uk-UA"/>
+        </w:rPr>
+        <w:t>;</w:t>
+      </w:r>
     </w:p>
     <w:p>
       <w:pPr>
         <w:rPr>
           <w:rFonts w:ascii="Consolas" w:hAnsi="Consolas" w:cs="Consolas"/>
-          <w:color w:val="0000FF"/>
           <w:sz w:val="19"/>
           <w:szCs w:val="19"/>
           <w:lang w:val="uk-UA"/>
@@ -4130,18 +4140,7 @@
           <w:szCs w:val="19"/>
           <w:lang w:val="en-US"/>
         </w:rPr>
-        <w:t>WebAP</w:t>
-      </w:r>
-      <w:bookmarkStart w:id="0" w:name="_GoBack"/>
-      <w:bookmarkEnd w:id="0"/>
-      <w:r>
-        <w:rPr>
-          <w:rFonts w:ascii="Consolas" w:hAnsi="Consolas" w:cs="Consolas"/>
-          <w:sz w:val="19"/>
-          <w:szCs w:val="19"/>
-          <w:lang w:val="en-US"/>
-        </w:rPr>
-        <w:t>I</w:t>
+        <w:t>WebAPI</w:t>
       </w:r>
       <w:r>
         <w:rPr>
@@ -4151,6 +4150,692 @@
           <w:lang w:val="uk-UA"/>
         </w:rPr>
         <w:t>, які далі використовуються для розгортання</w:t>
+      </w:r>
+      <w:r>
+        <w:rPr>
+          <w:rFonts w:ascii="Consolas" w:hAnsi="Consolas" w:cs="Consolas"/>
+          <w:sz w:val="19"/>
+          <w:szCs w:val="19"/>
+          <w:lang w:val="uk-UA"/>
+        </w:rPr>
+        <w:t>;</w:t>
+      </w:r>
+    </w:p>
+    <w:p>
+      <w:pPr>
+        <w:rPr>
+          <w:rFonts w:ascii="Consolas" w:hAnsi="Consolas" w:cs="Consolas"/>
+          <w:color w:val="0000FF"/>
+          <w:sz w:val="19"/>
+          <w:szCs w:val="19"/>
+          <w:lang w:val="uk-UA"/>
+        </w:rPr>
+      </w:pPr>
+      <w:r>
+        <w:rPr>
+          <w:rFonts w:ascii="Consolas" w:hAnsi="Consolas" w:cs="Consolas"/>
+          <w:color w:val="0000FF"/>
+          <w:sz w:val="19"/>
+          <w:szCs w:val="19"/>
+          <w:lang w:val="uk-UA"/>
+        </w:rPr>
+        <w:t>publishModel.ps1</w:t>
+      </w:r>
+      <w:r>
+        <w:rPr>
+          <w:rFonts w:ascii="Consolas" w:hAnsi="Consolas" w:cs="Consolas"/>
+          <w:sz w:val="19"/>
+          <w:szCs w:val="19"/>
+          <w:lang w:val="uk-UA"/>
+        </w:rPr>
+        <w:t xml:space="preserve"> – </w:t>
+      </w:r>
+      <w:r>
+        <w:rPr>
+          <w:rFonts w:ascii="Consolas" w:hAnsi="Consolas" w:cs="Consolas"/>
+          <w:sz w:val="19"/>
+          <w:szCs w:val="19"/>
+          <w:lang w:val="en-US"/>
+        </w:rPr>
+        <w:t>PowerShell</w:t>
+      </w:r>
+      <w:r>
+        <w:rPr>
+          <w:rFonts w:ascii="Consolas" w:hAnsi="Consolas" w:cs="Consolas"/>
+          <w:sz w:val="19"/>
+          <w:szCs w:val="19"/>
+          <w:lang w:val="uk-UA"/>
+        </w:rPr>
+        <w:t xml:space="preserve"> </w:t>
+      </w:r>
+      <w:r>
+        <w:rPr>
+          <w:rFonts w:ascii="Consolas" w:hAnsi="Consolas" w:cs="Consolas"/>
+          <w:sz w:val="19"/>
+          <w:szCs w:val="19"/>
+          <w:lang w:val="uk-UA"/>
+        </w:rPr>
+        <w:t>скрипт</w:t>
+      </w:r>
+      <w:r>
+        <w:rPr>
+          <w:rFonts w:ascii="Consolas" w:hAnsi="Consolas" w:cs="Consolas"/>
+          <w:sz w:val="19"/>
+          <w:szCs w:val="19"/>
+          <w:lang w:val="uk-UA"/>
+        </w:rPr>
+        <w:t xml:space="preserve">, після оновлення </w:t>
+      </w:r>
+      <w:r>
+        <w:rPr>
+          <w:rFonts w:ascii="Consolas" w:hAnsi="Consolas" w:cs="Consolas"/>
+          <w:sz w:val="19"/>
+          <w:szCs w:val="19"/>
+          <w:lang w:val="en-US"/>
+        </w:rPr>
+        <w:t>EF</w:t>
+      </w:r>
+      <w:r>
+        <w:rPr>
+          <w:rFonts w:ascii="Consolas" w:hAnsi="Consolas" w:cs="Consolas"/>
+          <w:sz w:val="19"/>
+          <w:szCs w:val="19"/>
+          <w:lang w:val="uk-UA"/>
+        </w:rPr>
+        <w:t xml:space="preserve"> </w:t>
+      </w:r>
+      <w:r>
+        <w:rPr>
+          <w:rFonts w:ascii="Consolas" w:hAnsi="Consolas" w:cs="Consolas"/>
+          <w:sz w:val="19"/>
+          <w:szCs w:val="19"/>
+          <w:lang w:val="uk-UA"/>
+        </w:rPr>
+        <w:t xml:space="preserve">структури </w:t>
+      </w:r>
+      <w:r>
+        <w:rPr>
+          <w:rFonts w:ascii="Consolas" w:hAnsi="Consolas" w:cs="Consolas"/>
+          <w:sz w:val="19"/>
+          <w:szCs w:val="19"/>
+          <w:lang w:val="uk-UA"/>
+        </w:rPr>
+        <w:t>(</w:t>
+      </w:r>
+      <w:r>
+        <w:rPr>
+          <w:rFonts w:ascii="Consolas" w:hAnsi="Consolas" w:cs="Consolas"/>
+          <w:sz w:val="19"/>
+          <w:szCs w:val="19"/>
+          <w:lang w:val="uk-UA"/>
+        </w:rPr>
+        <w:t xml:space="preserve">класи, </w:t>
+      </w:r>
+      <w:r>
+        <w:rPr>
+          <w:rFonts w:ascii="Consolas" w:hAnsi="Consolas" w:cs="Consolas"/>
+          <w:sz w:val="19"/>
+          <w:szCs w:val="19"/>
+          <w:lang w:val="en-US"/>
+        </w:rPr>
+        <w:t>Model</w:t>
+      </w:r>
+      <w:r>
+        <w:rPr>
+          <w:rFonts w:ascii="Consolas" w:hAnsi="Consolas" w:cs="Consolas"/>
+          <w:sz w:val="19"/>
+          <w:szCs w:val="19"/>
+          <w:lang w:val="uk-UA"/>
+        </w:rPr>
+        <w:t>)</w:t>
+      </w:r>
+      <w:r>
+        <w:rPr>
+          <w:rFonts w:ascii="Consolas" w:hAnsi="Consolas" w:cs="Consolas"/>
+          <w:sz w:val="19"/>
+          <w:szCs w:val="19"/>
+          <w:lang w:val="uk-UA"/>
+        </w:rPr>
+        <w:t xml:space="preserve"> БД через </w:t>
+      </w:r>
+      <w:r>
+        <w:rPr>
+          <w:rFonts w:ascii="Consolas" w:hAnsi="Consolas" w:cs="Consolas"/>
+          <w:sz w:val="19"/>
+          <w:szCs w:val="19"/>
+          <w:lang w:val="en-US"/>
+        </w:rPr>
+        <w:t>Scaffold</w:t>
+      </w:r>
+      <w:r>
+        <w:rPr>
+          <w:rFonts w:ascii="Consolas" w:hAnsi="Consolas" w:cs="Consolas"/>
+          <w:sz w:val="19"/>
+          <w:szCs w:val="19"/>
+          <w:lang w:val="uk-UA"/>
+        </w:rPr>
+        <w:t xml:space="preserve"> в проекті </w:t>
+      </w:r>
+      <w:r>
+        <w:rPr>
+          <w:rFonts w:ascii="Consolas" w:hAnsi="Consolas" w:cs="Consolas"/>
+          <w:color w:val="0000FF"/>
+          <w:sz w:val="19"/>
+          <w:szCs w:val="19"/>
+          <w:lang w:val="uk-UA"/>
+        </w:rPr>
+        <w:t>ipsmedserviceapp</w:t>
+      </w:r>
+      <w:r>
+        <w:rPr>
+          <w:rFonts w:ascii="Consolas" w:hAnsi="Consolas" w:cs="Consolas"/>
+          <w:sz w:val="19"/>
+          <w:szCs w:val="19"/>
+          <w:lang w:val="uk-UA"/>
+        </w:rPr>
+        <w:t xml:space="preserve"> потрібно запустити скрипт через </w:t>
+      </w:r>
+      <w:r>
+        <w:rPr>
+          <w:rFonts w:ascii="Consolas" w:hAnsi="Consolas" w:cs="Consolas"/>
+          <w:sz w:val="19"/>
+          <w:szCs w:val="19"/>
+          <w:lang w:val="en-US"/>
+        </w:rPr>
+        <w:t>Package</w:t>
+      </w:r>
+      <w:r>
+        <w:rPr>
+          <w:rFonts w:ascii="Consolas" w:hAnsi="Consolas" w:cs="Consolas"/>
+          <w:sz w:val="19"/>
+          <w:szCs w:val="19"/>
+          <w:lang w:val="uk-UA"/>
+        </w:rPr>
+        <w:t xml:space="preserve"> </w:t>
+      </w:r>
+      <w:r>
+        <w:rPr>
+          <w:rFonts w:ascii="Consolas" w:hAnsi="Consolas" w:cs="Consolas"/>
+          <w:sz w:val="19"/>
+          <w:szCs w:val="19"/>
+          <w:lang w:val="en-US"/>
+        </w:rPr>
+        <w:t>Manager</w:t>
+      </w:r>
+      <w:r>
+        <w:rPr>
+          <w:rFonts w:ascii="Consolas" w:hAnsi="Consolas" w:cs="Consolas"/>
+          <w:sz w:val="19"/>
+          <w:szCs w:val="19"/>
+          <w:lang w:val="uk-UA"/>
+        </w:rPr>
+        <w:t xml:space="preserve"> </w:t>
+      </w:r>
+      <w:r>
+        <w:rPr>
+          <w:rFonts w:ascii="Consolas" w:hAnsi="Consolas" w:cs="Consolas"/>
+          <w:sz w:val="19"/>
+          <w:szCs w:val="19"/>
+          <w:lang w:val="en-US"/>
+        </w:rPr>
+        <w:t>Console</w:t>
+      </w:r>
+      <w:r>
+        <w:rPr>
+          <w:rFonts w:ascii="Consolas" w:hAnsi="Consolas" w:cs="Consolas"/>
+          <w:sz w:val="19"/>
+          <w:szCs w:val="19"/>
+          <w:lang w:val="uk-UA"/>
+        </w:rPr>
+        <w:t>, він оновить структуру</w:t>
+      </w:r>
+      <w:r>
+        <w:rPr>
+          <w:rFonts w:ascii="Consolas" w:hAnsi="Consolas" w:cs="Consolas"/>
+          <w:sz w:val="19"/>
+          <w:szCs w:val="19"/>
+          <w:lang w:val="uk-UA"/>
+        </w:rPr>
+        <w:t xml:space="preserve"> (</w:t>
+      </w:r>
+      <w:r>
+        <w:rPr>
+          <w:rFonts w:ascii="Consolas" w:hAnsi="Consolas" w:cs="Consolas"/>
+          <w:sz w:val="19"/>
+          <w:szCs w:val="19"/>
+          <w:lang w:val="uk-UA"/>
+        </w:rPr>
+        <w:t xml:space="preserve">класи, </w:t>
+      </w:r>
+      <w:r>
+        <w:rPr>
+          <w:rFonts w:ascii="Consolas" w:hAnsi="Consolas" w:cs="Consolas"/>
+          <w:sz w:val="19"/>
+          <w:szCs w:val="19"/>
+          <w:lang w:val="en-US"/>
+        </w:rPr>
+        <w:t>Model</w:t>
+      </w:r>
+      <w:r>
+        <w:rPr>
+          <w:rFonts w:ascii="Consolas" w:hAnsi="Consolas" w:cs="Consolas"/>
+          <w:sz w:val="19"/>
+          <w:szCs w:val="19"/>
+          <w:lang w:val="uk-UA"/>
+        </w:rPr>
+        <w:t>)</w:t>
+      </w:r>
+      <w:r>
+        <w:rPr>
+          <w:rFonts w:ascii="Consolas" w:hAnsi="Consolas" w:cs="Consolas"/>
+          <w:sz w:val="19"/>
+          <w:szCs w:val="19"/>
+          <w:lang w:val="uk-UA"/>
+        </w:rPr>
+        <w:t xml:space="preserve"> в проекті </w:t>
+      </w:r>
+      <w:r>
+        <w:rPr>
+          <w:rFonts w:ascii="Consolas" w:hAnsi="Consolas" w:cs="Consolas"/>
+          <w:color w:val="0000FF"/>
+          <w:sz w:val="19"/>
+          <w:szCs w:val="19"/>
+          <w:lang w:val="uk-UA"/>
+        </w:rPr>
+        <w:t>ipsFormsDesign</w:t>
+      </w:r>
+      <w:r>
+        <w:rPr>
+          <w:rFonts w:ascii="Consolas" w:hAnsi="Consolas" w:cs="Consolas"/>
+          <w:sz w:val="19"/>
+          <w:szCs w:val="19"/>
+          <w:lang w:val="uk-UA"/>
+        </w:rPr>
+        <w:t xml:space="preserve"> клієнтської частини комплексу, проставить атрибути </w:t>
+      </w:r>
+      <w:r>
+        <w:rPr>
+          <w:rFonts w:ascii="Consolas" w:hAnsi="Consolas" w:cs="Consolas"/>
+          <w:sz w:val="19"/>
+          <w:szCs w:val="19"/>
+          <w:lang w:val="uk-UA"/>
+        </w:rPr>
+        <w:t>[</w:t>
+      </w:r>
+      <w:r>
+        <w:rPr>
+          <w:rFonts w:ascii="Consolas" w:hAnsi="Consolas" w:cs="Consolas"/>
+          <w:sz w:val="19"/>
+          <w:szCs w:val="19"/>
+          <w:lang w:val="en-US"/>
+        </w:rPr>
+        <w:t>JsonIgnore</w:t>
+      </w:r>
+      <w:r>
+        <w:rPr>
+          <w:rFonts w:ascii="Consolas" w:hAnsi="Consolas" w:cs="Consolas"/>
+          <w:sz w:val="19"/>
+          <w:szCs w:val="19"/>
+          <w:lang w:val="uk-UA"/>
+        </w:rPr>
+        <w:t xml:space="preserve">] </w:t>
+      </w:r>
+      <w:r>
+        <w:rPr>
+          <w:rFonts w:ascii="Consolas" w:hAnsi="Consolas" w:cs="Consolas"/>
+          <w:sz w:val="19"/>
+          <w:szCs w:val="19"/>
+          <w:lang w:val="uk-UA"/>
+        </w:rPr>
+        <w:t>згідно файлу</w:t>
+      </w:r>
+      <w:r>
+        <w:rPr>
+          <w:rFonts w:ascii="Consolas" w:hAnsi="Consolas" w:cs="Consolas"/>
+          <w:sz w:val="19"/>
+          <w:szCs w:val="19"/>
+          <w:lang w:val="uk-UA"/>
+        </w:rPr>
+        <w:t xml:space="preserve"> </w:t>
+      </w:r>
+      <w:r>
+        <w:rPr>
+          <w:rFonts w:ascii="Consolas" w:hAnsi="Consolas" w:cs="Consolas"/>
+          <w:color w:val="0000FF"/>
+          <w:sz w:val="19"/>
+          <w:szCs w:val="19"/>
+          <w:lang w:val="uk-UA"/>
+        </w:rPr>
+        <w:t>JsonIgnore.xml</w:t>
+      </w:r>
+      <w:r>
+        <w:rPr>
+          <w:rFonts w:ascii="Consolas" w:hAnsi="Consolas" w:cs="Consolas"/>
+          <w:sz w:val="19"/>
+          <w:szCs w:val="19"/>
+          <w:lang w:val="uk-UA"/>
+        </w:rPr>
+        <w:t>;</w:t>
+      </w:r>
+    </w:p>
+    <w:p>
+      <w:pPr>
+        <w:rPr>
+          <w:rFonts w:ascii="Consolas" w:hAnsi="Consolas" w:cs="Consolas"/>
+          <w:sz w:val="19"/>
+          <w:szCs w:val="19"/>
+          <w:lang w:val="uk-UA"/>
+        </w:rPr>
+      </w:pPr>
+      <w:r>
+        <w:rPr>
+          <w:rFonts w:ascii="Consolas" w:hAnsi="Consolas" w:cs="Consolas"/>
+          <w:color w:val="0000FF"/>
+          <w:sz w:val="19"/>
+          <w:szCs w:val="19"/>
+          <w:lang w:val="uk-UA"/>
+        </w:rPr>
+        <w:t>SetJsonIgnore.ps1</w:t>
+      </w:r>
+      <w:r>
+        <w:rPr>
+          <w:rFonts w:ascii="Consolas" w:hAnsi="Consolas" w:cs="Consolas"/>
+          <w:sz w:val="19"/>
+          <w:szCs w:val="19"/>
+          <w:lang w:val="uk-UA"/>
+        </w:rPr>
+        <w:t xml:space="preserve"> – </w:t>
+      </w:r>
+      <w:r>
+        <w:rPr>
+          <w:rFonts w:ascii="Consolas" w:hAnsi="Consolas" w:cs="Consolas"/>
+          <w:sz w:val="19"/>
+          <w:szCs w:val="19"/>
+          <w:lang w:val="en-US"/>
+        </w:rPr>
+        <w:t>PowerShell</w:t>
+      </w:r>
+      <w:r>
+        <w:rPr>
+          <w:rFonts w:ascii="Consolas" w:hAnsi="Consolas" w:cs="Consolas"/>
+          <w:sz w:val="19"/>
+          <w:szCs w:val="19"/>
+          <w:lang w:val="uk-UA"/>
+        </w:rPr>
+        <w:t xml:space="preserve"> </w:t>
+      </w:r>
+      <w:r>
+        <w:rPr>
+          <w:rFonts w:ascii="Consolas" w:hAnsi="Consolas" w:cs="Consolas"/>
+          <w:sz w:val="19"/>
+          <w:szCs w:val="19"/>
+          <w:lang w:val="uk-UA"/>
+        </w:rPr>
+        <w:t xml:space="preserve">скрипт, використовується </w:t>
+      </w:r>
+      <w:r>
+        <w:rPr>
+          <w:rFonts w:ascii="Consolas" w:hAnsi="Consolas" w:cs="Consolas"/>
+          <w:sz w:val="19"/>
+          <w:szCs w:val="19"/>
+          <w:lang w:val="uk-UA"/>
+        </w:rPr>
+        <w:t xml:space="preserve">та запускається </w:t>
+      </w:r>
+      <w:r>
+        <w:rPr>
+          <w:rFonts w:ascii="Consolas" w:hAnsi="Consolas" w:cs="Consolas"/>
+          <w:sz w:val="19"/>
+          <w:szCs w:val="19"/>
+          <w:lang w:val="uk-UA"/>
+        </w:rPr>
+        <w:t>в попередньому</w:t>
+      </w:r>
+      <w:r>
+        <w:rPr>
+          <w:rFonts w:ascii="Consolas" w:hAnsi="Consolas" w:cs="Consolas"/>
+          <w:sz w:val="19"/>
+          <w:szCs w:val="19"/>
+          <w:lang w:val="uk-UA"/>
+        </w:rPr>
+        <w:t xml:space="preserve">, проставляє </w:t>
+      </w:r>
+      <w:r>
+        <w:rPr>
+          <w:rFonts w:ascii="Consolas" w:hAnsi="Consolas" w:cs="Consolas"/>
+          <w:sz w:val="19"/>
+          <w:szCs w:val="19"/>
+          <w:lang w:val="uk-UA"/>
+        </w:rPr>
+        <w:t xml:space="preserve">атрибут </w:t>
+      </w:r>
+      <w:r>
+        <w:rPr>
+          <w:rFonts w:ascii="Consolas" w:hAnsi="Consolas" w:cs="Consolas"/>
+          <w:sz w:val="19"/>
+          <w:szCs w:val="19"/>
+          <w:lang w:val="uk-UA"/>
+        </w:rPr>
+        <w:t>[</w:t>
+      </w:r>
+      <w:r>
+        <w:rPr>
+          <w:rFonts w:ascii="Consolas" w:hAnsi="Consolas" w:cs="Consolas"/>
+          <w:sz w:val="19"/>
+          <w:szCs w:val="19"/>
+          <w:lang w:val="en-US"/>
+        </w:rPr>
+        <w:t>JsonIgnore</w:t>
+      </w:r>
+      <w:r>
+        <w:rPr>
+          <w:rFonts w:ascii="Consolas" w:hAnsi="Consolas" w:cs="Consolas"/>
+          <w:sz w:val="19"/>
+          <w:szCs w:val="19"/>
+          <w:lang w:val="uk-UA"/>
+        </w:rPr>
+        <w:t>]</w:t>
+      </w:r>
+      <w:r>
+        <w:rPr>
+          <w:rFonts w:ascii="Consolas" w:hAnsi="Consolas" w:cs="Consolas"/>
+          <w:sz w:val="19"/>
+          <w:szCs w:val="19"/>
+          <w:lang w:val="uk-UA"/>
+        </w:rPr>
+        <w:t>;</w:t>
+      </w:r>
+    </w:p>
+    <w:p>
+      <w:pPr>
+        <w:rPr>
+          <w:rFonts w:ascii="Consolas" w:hAnsi="Consolas" w:cs="Consolas"/>
+          <w:color w:val="0000FF"/>
+          <w:sz w:val="19"/>
+          <w:szCs w:val="19"/>
+          <w:lang w:val="uk-UA"/>
+        </w:rPr>
+      </w:pPr>
+      <w:r>
+        <w:rPr>
+          <w:rFonts w:ascii="Consolas" w:hAnsi="Consolas" w:cs="Consolas"/>
+          <w:color w:val="0000FF"/>
+          <w:sz w:val="19"/>
+          <w:szCs w:val="19"/>
+          <w:lang w:val="uk-UA"/>
+        </w:rPr>
+        <w:t>JsonIgnore.xml</w:t>
+      </w:r>
+      <w:r>
+        <w:rPr>
+          <w:rFonts w:ascii="Consolas" w:hAnsi="Consolas" w:cs="Consolas"/>
+          <w:sz w:val="19"/>
+          <w:szCs w:val="19"/>
+          <w:lang w:val="uk-UA"/>
+        </w:rPr>
+        <w:t xml:space="preserve"> –</w:t>
+      </w:r>
+      <w:r>
+        <w:rPr>
+          <w:rFonts w:ascii="Consolas" w:hAnsi="Consolas" w:cs="Consolas"/>
+          <w:sz w:val="19"/>
+          <w:szCs w:val="19"/>
+          <w:lang w:val="uk-UA"/>
+        </w:rPr>
+        <w:t xml:space="preserve"> </w:t>
+      </w:r>
+      <w:r>
+        <w:rPr>
+          <w:rFonts w:ascii="Consolas" w:hAnsi="Consolas" w:cs="Consolas"/>
+          <w:sz w:val="19"/>
+          <w:szCs w:val="19"/>
+          <w:lang w:val="en-US"/>
+        </w:rPr>
+        <w:t>XML</w:t>
+      </w:r>
+      <w:r>
+        <w:rPr>
+          <w:rFonts w:ascii="Consolas" w:hAnsi="Consolas" w:cs="Consolas"/>
+          <w:sz w:val="19"/>
+          <w:szCs w:val="19"/>
+          <w:lang w:val="uk-UA"/>
+        </w:rPr>
+        <w:t xml:space="preserve"> </w:t>
+      </w:r>
+      <w:r>
+        <w:rPr>
+          <w:rFonts w:ascii="Consolas" w:hAnsi="Consolas" w:cs="Consolas"/>
+          <w:sz w:val="19"/>
+          <w:szCs w:val="19"/>
+          <w:lang w:val="uk-UA"/>
+        </w:rPr>
+        <w:t xml:space="preserve">документ з назвами </w:t>
+      </w:r>
+      <w:r>
+        <w:rPr>
+          <w:rFonts w:ascii="Consolas" w:hAnsi="Consolas" w:cs="Consolas"/>
+          <w:sz w:val="19"/>
+          <w:szCs w:val="19"/>
+          <w:lang w:val="en-US"/>
+        </w:rPr>
+        <w:t>EF</w:t>
+      </w:r>
+      <w:r>
+        <w:rPr>
+          <w:rFonts w:ascii="Consolas" w:hAnsi="Consolas" w:cs="Consolas"/>
+          <w:sz w:val="19"/>
+          <w:szCs w:val="19"/>
+          <w:lang w:val="uk-UA"/>
+        </w:rPr>
+        <w:t xml:space="preserve"> класів</w:t>
+      </w:r>
+      <w:r>
+        <w:rPr>
+          <w:rFonts w:ascii="Consolas" w:hAnsi="Consolas" w:cs="Consolas"/>
+          <w:sz w:val="19"/>
+          <w:szCs w:val="19"/>
+          <w:lang w:val="uk-UA"/>
+        </w:rPr>
+        <w:t xml:space="preserve"> та їх властивостей і т.д.</w:t>
+      </w:r>
+      <w:r>
+        <w:rPr>
+          <w:rFonts w:ascii="Consolas" w:hAnsi="Consolas" w:cs="Consolas"/>
+          <w:sz w:val="19"/>
+          <w:szCs w:val="19"/>
+          <w:lang w:val="uk-UA"/>
+        </w:rPr>
+        <w:t xml:space="preserve"> (відповідають таблиці БД) в яких потрібно </w:t>
+      </w:r>
+      <w:r>
+        <w:rPr>
+          <w:rFonts w:ascii="Consolas" w:hAnsi="Consolas" w:cs="Consolas"/>
+          <w:sz w:val="19"/>
+          <w:szCs w:val="19"/>
+          <w:lang w:val="uk-UA"/>
+        </w:rPr>
+        <w:t xml:space="preserve">проставити атрибут </w:t>
+      </w:r>
+      <w:r>
+        <w:rPr>
+          <w:rFonts w:ascii="Consolas" w:hAnsi="Consolas" w:cs="Consolas"/>
+          <w:sz w:val="19"/>
+          <w:szCs w:val="19"/>
+          <w:lang w:val="uk-UA"/>
+        </w:rPr>
+        <w:t>[</w:t>
+      </w:r>
+      <w:r>
+        <w:rPr>
+          <w:rFonts w:ascii="Consolas" w:hAnsi="Consolas" w:cs="Consolas"/>
+          <w:sz w:val="19"/>
+          <w:szCs w:val="19"/>
+          <w:lang w:val="en-US"/>
+        </w:rPr>
+        <w:t>JsonIgnore</w:t>
+      </w:r>
+      <w:r>
+        <w:rPr>
+          <w:rFonts w:ascii="Consolas" w:hAnsi="Consolas" w:cs="Consolas"/>
+          <w:sz w:val="19"/>
+          <w:szCs w:val="19"/>
+          <w:lang w:val="uk-UA"/>
+        </w:rPr>
+        <w:t>]</w:t>
+      </w:r>
+      <w:r>
+        <w:rPr>
+          <w:rFonts w:ascii="Consolas" w:hAnsi="Consolas" w:cs="Consolas"/>
+          <w:sz w:val="19"/>
+          <w:szCs w:val="19"/>
+          <w:lang w:val="uk-UA"/>
+        </w:rPr>
+        <w:t xml:space="preserve"> за винятком елементів </w:t>
+      </w:r>
+      <w:r>
+        <w:rPr>
+          <w:rStyle w:val="t1"/>
+          <w:rFonts w:ascii="Verdana" w:hAnsi="Verdana"/>
+          <w:sz w:val="20"/>
+          <w:szCs w:val="20"/>
+        </w:rPr>
+        <w:t>noignore</w:t>
+      </w:r>
+      <w:r>
+        <w:rPr>
+          <w:rFonts w:ascii="Consolas" w:hAnsi="Consolas" w:cs="Consolas"/>
+          <w:sz w:val="19"/>
+          <w:szCs w:val="19"/>
+          <w:lang w:val="uk-UA"/>
+        </w:rPr>
+        <w:t xml:space="preserve"> (може бути ссилка в таблиці на іншу таблицю, в якій в свою чергу є ссилка на попередню – зациклення, так </w:t>
+      </w:r>
+      <w:r>
+        <w:rPr>
+          <w:rFonts w:ascii="Consolas" w:hAnsi="Consolas" w:cs="Consolas"/>
+          <w:sz w:val="19"/>
+          <w:szCs w:val="19"/>
+          <w:lang w:val="en-US"/>
+        </w:rPr>
+        <w:t>EF</w:t>
+      </w:r>
+      <w:r>
+        <w:rPr>
+          <w:rFonts w:ascii="Consolas" w:hAnsi="Consolas" w:cs="Consolas"/>
+          <w:sz w:val="19"/>
+          <w:szCs w:val="19"/>
+          <w:lang w:val="uk-UA"/>
+        </w:rPr>
+        <w:t xml:space="preserve"> </w:t>
+      </w:r>
+      <w:r>
+        <w:rPr>
+          <w:rFonts w:ascii="Consolas" w:hAnsi="Consolas" w:cs="Consolas"/>
+          <w:sz w:val="19"/>
+          <w:szCs w:val="19"/>
+          <w:lang w:val="uk-UA"/>
+        </w:rPr>
+        <w:t>будує структуру за стандартними налаштуваннями)</w:t>
       </w:r>
     </w:p>
     <w:sectPr>
@@ -5259,6 +5944,14 @@
       <w:u w:val="single"/>
     </w:rPr>
   </w:style>
+  <w:style w:type="character" w:customStyle="1" w:styleId="t1">
+    <w:name w:val="t1"/>
+    <w:basedOn w:val="a0"/>
+    <w:rsid w:val="001C5897"/>
+    <w:rPr>
+      <w:color w:val="990000"/>
+    </w:rPr>
+  </w:style>
 </w:styles>
 </file>
 

</xml_diff>